<commit_message>
feat: implement person data schema and add Flutter UI components for case and person management
</commit_message>
<xml_diff>
--- a/templates/person/bao_cao_bat_giu.docx
+++ b/templates/person/bao_cao_bat_giu.docx
@@ -904,13 +904,13 @@
         <w:tblLook w:val="0000" w:firstRow="0" w:lastRow="0" w:firstColumn="0" w:lastColumn="0" w:noHBand="0" w:noVBand="0"/>
       </w:tblPr>
       <w:tblGrid>
-        <w:gridCol w:w="1987"/>
-        <w:gridCol w:w="583"/>
+        <w:gridCol w:w="1859"/>
+        <w:gridCol w:w="1410"/>
         <w:gridCol w:w="1476"/>
-        <w:gridCol w:w="1603"/>
+        <w:gridCol w:w="1402"/>
         <w:gridCol w:w="1783"/>
-        <w:gridCol w:w="1513"/>
-        <w:gridCol w:w="633"/>
+        <w:gridCol w:w="1169"/>
+        <w:gridCol w:w="479"/>
       </w:tblGrid>
       <w:tr>
         <w:trPr>
@@ -1274,6 +1274,9 @@
             <w:pPr>
               <w:spacing w:line="276" w:lineRule="auto"/>
             </w:pPr>
+            <w:r>
+              <w:t>{{ item.gioi_tinh }}</w:t>
+            </w:r>
           </w:p>
         </w:tc>
         <w:tc>

</xml_diff>